<commit_message>
feat(Readme): Udpated the readme file
</commit_message>
<xml_diff>
--- a/docs/Nova_Scheduler_Documentation.docx
+++ b/docs/Nova_Scheduler_Documentation.docx
@@ -1728,9 +1728,9 @@
       </w:pPr>
       <w:r>
         <w:drawing>
-          <wp:inline distT="0" distB="0" distL="0" distR="0" wp14:anchorId="6BD9DC55" wp14:editId="7FEE5B60">
-            <wp:extent cx="5943600" cy="2966720"/>
-            <wp:effectExtent l="0" t="0" r="0" b="5080"/>
+          <wp:inline distT="0" distB="0" distL="0" distR="0" wp14:anchorId="6BD9DC55" wp14:editId="25945BD3">
+            <wp:extent cx="5070523" cy="2530928"/>
+            <wp:effectExtent l="0" t="0" r="0" b="3175"/>
             <wp:docPr id="1805958844" name="Picture 1"/>
             <wp:cNvGraphicFramePr>
               <a:graphicFrameLocks xmlns:a="http://schemas.openxmlformats.org/drawingml/2006/main" noChangeAspect="1"/>
@@ -1751,7 +1751,7 @@
                   <pic:spPr>
                     <a:xfrm>
                       <a:off x="0" y="0"/>
-                      <a:ext cx="5943600" cy="2966720"/>
+                      <a:ext cx="5095951" cy="2543620"/>
                     </a:xfrm>
                     <a:prstGeom prst="rect">
                       <a:avLst/>

</xml_diff>